<commit_message>
Add Section 9 for pal_tv_bram_lite_v2 to CODE_WALKTHROUGH
Documents all key aspects of the lite v2 core:
- Pattern selections (sel 0-6)
- Corrected timing constants (V_ACT_S_F1=25, V_ACT_S_F2=337)
- FSS sub-line h_cnt logic for F2 half-line alignment
- 11-zone gradient (sel 5/6)
- Output port descriptions

Co-Authored-By: Claude Opus 4.7 <noreply@anthropic.com>
Claude-Session: https://claude.ai/code/session_017hYU7zmWoUoe7kPyUjvHZ6
</commit_message>
<xml_diff>
--- a/docs/CODE_WALKTHROUGH.docx
+++ b/docs/CODE_WALKTHROUGH.docx
@@ -8319,6 +8319,936 @@
         </w:tc>
       </w:tr>
     </w:tbl>
+    <w:p>
+      <w:r>
+        <w:br w:type="page"/>
+      </w:r>
+    </w:p>
+    <w:p>
+      <w:pPr>
+        <w:spacing w:before="200" w:after="80"/>
+      </w:pPr>
+      <w:r>
+        <w:rPr>
+          <w:rFonts w:ascii="Calibri" w:hAnsi="Calibri"/>
+          <w:b/>
+          <w:color w:val="00275A"/>
+          <w:sz w:val="32"/>
+        </w:rPr>
+        <w:t>9  pal_tv_bram_lite_v2.vhd  —  PAL BRAM Lite (Extended Patterns)</w:t>
+      </w:r>
+    </w:p>
+    <w:tbl>
+      <w:tblPr>
+        <w:tblStyle w:val="TableGrid"/>
+        <w:tblW w:type="auto" w:w="0"/>
+        <w:tblLook w:firstColumn="1" w:firstRow="1" w:lastColumn="0" w:lastRow="0" w:noHBand="0" w:noVBand="1" w:val="04A0"/>
+      </w:tblPr>
+      <w:tblGrid>
+        <w:gridCol w:w="9360"/>
+      </w:tblGrid>
+      <w:tr>
+        <w:tc>
+          <w:tcPr>
+            <w:tcW w:type="dxa" w:w="9360"/>
+            <w:shd w:val="clear" w:color="auto" w:fill="00275A"/>
+          </w:tcPr>
+          <w:p>
+            <w:r>
+              <w:rPr>
+                <w:rFonts w:ascii="Courier New" w:hAnsi="Courier New"/>
+                <w:b/>
+                <w:color w:val="FFC000"/>
+                <w:sz w:val="20"/>
+              </w:rPr>
+              <w:t>FILE:  tv/bram/pal_tv_bram_lite_v2.vhd</w:t>
+              <w:br/>
+            </w:r>
+            <w:r>
+              <w:rPr>
+                <w:rFonts w:ascii="Calibri" w:hAnsi="Calibri"/>
+                <w:color w:val="FFFFFF"/>
+                <w:sz w:val="20"/>
+              </w:rPr>
+              <w:t>Lightweight single-buffer PAL video core with 7 pattern selections (sel 0–6). Extends pal_tv_bram_lite with two 11-zone gradient patterns (sel 5/6) and corrected timing outputs for aircraft/MFD applications: fss_o (Field Sync Signal), frame_sync_o (25 Hz), and blank_o. No double-buffer, no bouncing ball, no crosshatch overlay. Dependencies: tv/pal_timing.vhd, tv/opt2_interlaced/pal_csync_il.vhd.</w:t>
+            </w:r>
+          </w:p>
+        </w:tc>
+      </w:tr>
+    </w:tbl>
+    <w:p/>
+    <w:p>
+      <w:pPr>
+        <w:spacing w:before="120" w:after="80"/>
+      </w:pPr>
+      <w:r>
+        <w:rPr>
+          <w:rFonts w:ascii="Calibri" w:hAnsi="Calibri"/>
+          <w:b/>
+          <w:color w:val="005B96"/>
+          <w:sz w:val="26"/>
+        </w:rPr>
+        <w:t>9.1  Pattern Selections</w:t>
+      </w:r>
+    </w:p>
+    <w:tbl>
+      <w:tblPr>
+        <w:tblStyle w:val="TableGrid"/>
+        <w:tblW w:type="auto" w:w="0"/>
+        <w:tblLook w:firstColumn="1" w:firstRow="1" w:lastColumn="0" w:lastRow="0" w:noHBand="0" w:noVBand="1" w:val="04A0"/>
+      </w:tblPr>
+      <w:tblGrid>
+        <w:gridCol w:w="3120"/>
+        <w:gridCol w:w="3120"/>
+        <w:gridCol w:w="3120"/>
+      </w:tblGrid>
+      <w:tr>
+        <w:tc>
+          <w:tcPr>
+            <w:tcW w:type="dxa" w:w="3120"/>
+            <w:shd w:val="clear" w:color="auto" w:fill="00275A"/>
+          </w:tcPr>
+          <w:p>
+            <w:pPr>
+              <w:jc w:val="left"/>
+            </w:pPr>
+            <w:r>
+              <w:rPr>
+                <w:rFonts w:ascii="Calibri" w:hAnsi="Calibri"/>
+                <w:b/>
+                <w:i w:val="0"/>
+                <w:color w:val="FFFFFF"/>
+                <w:sz w:val="20"/>
+              </w:rPr>
+              <w:t>sel value</w:t>
+            </w:r>
+          </w:p>
+        </w:tc>
+        <w:tc>
+          <w:tcPr>
+            <w:tcW w:type="dxa" w:w="3120"/>
+            <w:shd w:val="clear" w:color="auto" w:fill="00275A"/>
+          </w:tcPr>
+          <w:p>
+            <w:pPr>
+              <w:jc w:val="left"/>
+            </w:pPr>
+            <w:r>
+              <w:rPr>
+                <w:rFonts w:ascii="Calibri" w:hAnsi="Calibri"/>
+                <w:b/>
+                <w:i w:val="0"/>
+                <w:color w:val="FFFFFF"/>
+                <w:sz w:val="20"/>
+              </w:rPr>
+              <w:t>Pattern</w:t>
+            </w:r>
+          </w:p>
+        </w:tc>
+        <w:tc>
+          <w:tcPr>
+            <w:tcW w:type="dxa" w:w="3120"/>
+            <w:shd w:val="clear" w:color="auto" w:fill="00275A"/>
+          </w:tcPr>
+          <w:p>
+            <w:pPr>
+              <w:jc w:val="left"/>
+            </w:pPr>
+            <w:r>
+              <w:rPr>
+                <w:rFonts w:ascii="Calibri" w:hAnsi="Calibri"/>
+                <w:b/>
+                <w:i w:val="0"/>
+                <w:color w:val="FFFFFF"/>
+                <w:sz w:val="20"/>
+              </w:rPr>
+              <w:t>Description</w:t>
+            </w:r>
+          </w:p>
+        </w:tc>
+      </w:tr>
+      <w:tr>
+        <w:tc>
+          <w:tcPr>
+            <w:tcW w:type="dxa" w:w="3120"/>
+            <w:shd w:val="clear" w:color="auto" w:fill="D6E4F7"/>
+          </w:tcPr>
+          <w:p>
+            <w:pPr>
+              <w:jc w:val="left"/>
+            </w:pPr>
+            <w:r>
+              <w:rPr>
+                <w:rFonts w:ascii="Calibri" w:hAnsi="Calibri"/>
+                <w:b/>
+                <w:i w:val="0"/>
+                <w:color w:val="000000"/>
+                <w:sz w:val="20"/>
+              </w:rPr>
+              <w:t>0</w:t>
+            </w:r>
+          </w:p>
+        </w:tc>
+        <w:tc>
+          <w:tcPr>
+            <w:tcW w:type="dxa" w:w="3120"/>
+          </w:tcPr>
+          <w:p>
+            <w:pPr>
+              <w:jc w:val="left"/>
+            </w:pPr>
+            <w:r>
+              <w:rPr>
+                <w:rFonts w:ascii="Calibri" w:hAnsi="Calibri"/>
+                <w:b w:val="0"/>
+                <w:i w:val="0"/>
+                <w:color w:val="000000"/>
+                <w:sz w:val="20"/>
+              </w:rPr>
+              <w:t>Vertical bars</w:t>
+            </w:r>
+          </w:p>
+        </w:tc>
+        <w:tc>
+          <w:tcPr>
+            <w:tcW w:type="dxa" w:w="3120"/>
+          </w:tcPr>
+          <w:p>
+            <w:pPr>
+              <w:jc w:val="left"/>
+            </w:pPr>
+            <w:r>
+              <w:rPr>
+                <w:rFonts w:ascii="Calibri" w:hAnsi="Calibri"/>
+                <w:b w:val="0"/>
+                <w:i w:val="0"/>
+                <w:color w:val="000000"/>
+                <w:sz w:val="20"/>
+              </w:rPr>
+              <w:t>8-zone checkerboard vertical stripes</w:t>
+            </w:r>
+          </w:p>
+        </w:tc>
+      </w:tr>
+      <w:tr>
+        <w:tc>
+          <w:tcPr>
+            <w:tcW w:type="dxa" w:w="3120"/>
+            <w:shd w:val="clear" w:color="auto" w:fill="D6E4F7"/>
+          </w:tcPr>
+          <w:p>
+            <w:pPr>
+              <w:jc w:val="left"/>
+            </w:pPr>
+            <w:r>
+              <w:rPr>
+                <w:rFonts w:ascii="Calibri" w:hAnsi="Calibri"/>
+                <w:b/>
+                <w:i w:val="0"/>
+                <w:color w:val="000000"/>
+                <w:sz w:val="20"/>
+              </w:rPr>
+              <w:t>1</w:t>
+            </w:r>
+          </w:p>
+        </w:tc>
+        <w:tc>
+          <w:tcPr>
+            <w:tcW w:type="dxa" w:w="3120"/>
+          </w:tcPr>
+          <w:p>
+            <w:pPr>
+              <w:jc w:val="left"/>
+            </w:pPr>
+            <w:r>
+              <w:rPr>
+                <w:rFonts w:ascii="Calibri" w:hAnsi="Calibri"/>
+                <w:b w:val="0"/>
+                <w:i w:val="0"/>
+                <w:color w:val="000000"/>
+                <w:sz w:val="20"/>
+              </w:rPr>
+              <w:t>Horizontal bars</w:t>
+            </w:r>
+          </w:p>
+        </w:tc>
+        <w:tc>
+          <w:tcPr>
+            <w:tcW w:type="dxa" w:w="3120"/>
+          </w:tcPr>
+          <w:p>
+            <w:pPr>
+              <w:jc w:val="left"/>
+            </w:pPr>
+            <w:r>
+              <w:rPr>
+                <w:rFonts w:ascii="Calibri" w:hAnsi="Calibri"/>
+                <w:b w:val="0"/>
+                <w:i w:val="0"/>
+                <w:color w:val="000000"/>
+                <w:sz w:val="20"/>
+              </w:rPr>
+              <w:t>8-zone checkerboard horizontal stripes</w:t>
+            </w:r>
+          </w:p>
+        </w:tc>
+      </w:tr>
+      <w:tr>
+        <w:tc>
+          <w:tcPr>
+            <w:tcW w:type="dxa" w:w="3120"/>
+            <w:shd w:val="clear" w:color="auto" w:fill="D6E4F7"/>
+          </w:tcPr>
+          <w:p>
+            <w:pPr>
+              <w:jc w:val="left"/>
+            </w:pPr>
+            <w:r>
+              <w:rPr>
+                <w:rFonts w:ascii="Calibri" w:hAnsi="Calibri"/>
+                <w:b/>
+                <w:i w:val="0"/>
+                <w:color w:val="000000"/>
+                <w:sz w:val="20"/>
+              </w:rPr>
+              <w:t>2</w:t>
+            </w:r>
+          </w:p>
+        </w:tc>
+        <w:tc>
+          <w:tcPr>
+            <w:tcW w:type="dxa" w:w="3120"/>
+          </w:tcPr>
+          <w:p>
+            <w:pPr>
+              <w:jc w:val="left"/>
+            </w:pPr>
+            <w:r>
+              <w:rPr>
+                <w:rFonts w:ascii="Calibri" w:hAnsi="Calibri"/>
+                <w:b w:val="0"/>
+                <w:i w:val="0"/>
+                <w:color w:val="000000"/>
+                <w:sz w:val="20"/>
+              </w:rPr>
+              <w:t>H-gradient (10 zones)</w:t>
+            </w:r>
+          </w:p>
+        </w:tc>
+        <w:tc>
+          <w:tcPr>
+            <w:tcW w:type="dxa" w:w="3120"/>
+          </w:tcPr>
+          <w:p>
+            <w:pPr>
+              <w:jc w:val="left"/>
+            </w:pPr>
+            <w:r>
+              <w:rPr>
+                <w:rFonts w:ascii="Calibri" w:hAnsi="Calibri"/>
+                <w:b w:val="0"/>
+                <w:i w:val="0"/>
+                <w:color w:val="000000"/>
+                <w:sz w:val="20"/>
+              </w:rPr>
+              <w:t>10 grey steps, ends at white (rightmost)</w:t>
+            </w:r>
+          </w:p>
+        </w:tc>
+      </w:tr>
+      <w:tr>
+        <w:tc>
+          <w:tcPr>
+            <w:tcW w:type="dxa" w:w="3120"/>
+            <w:shd w:val="clear" w:color="auto" w:fill="D6E4F7"/>
+          </w:tcPr>
+          <w:p>
+            <w:pPr>
+              <w:jc w:val="left"/>
+            </w:pPr>
+            <w:r>
+              <w:rPr>
+                <w:rFonts w:ascii="Calibri" w:hAnsi="Calibri"/>
+                <w:b/>
+                <w:i w:val="0"/>
+                <w:color w:val="000000"/>
+                <w:sz w:val="20"/>
+              </w:rPr>
+              <w:t>3</w:t>
+            </w:r>
+          </w:p>
+        </w:tc>
+        <w:tc>
+          <w:tcPr>
+            <w:tcW w:type="dxa" w:w="3120"/>
+          </w:tcPr>
+          <w:p>
+            <w:pPr>
+              <w:jc w:val="left"/>
+            </w:pPr>
+            <w:r>
+              <w:rPr>
+                <w:rFonts w:ascii="Calibri" w:hAnsi="Calibri"/>
+                <w:b w:val="0"/>
+                <w:i w:val="0"/>
+                <w:color w:val="000000"/>
+                <w:sz w:val="20"/>
+              </w:rPr>
+              <w:t>V-gradient (10 zones)</w:t>
+            </w:r>
+          </w:p>
+        </w:tc>
+        <w:tc>
+          <w:tcPr>
+            <w:tcW w:type="dxa" w:w="3120"/>
+          </w:tcPr>
+          <w:p>
+            <w:pPr>
+              <w:jc w:val="left"/>
+            </w:pPr>
+            <w:r>
+              <w:rPr>
+                <w:rFonts w:ascii="Calibri" w:hAnsi="Calibri"/>
+                <w:b w:val="0"/>
+                <w:i w:val="0"/>
+                <w:color w:val="000000"/>
+                <w:sz w:val="20"/>
+              </w:rPr>
+              <w:t>10 grey steps, ends at white (bottommost)</w:t>
+            </w:r>
+          </w:p>
+        </w:tc>
+      </w:tr>
+      <w:tr>
+        <w:tc>
+          <w:tcPr>
+            <w:tcW w:type="dxa" w:w="3120"/>
+            <w:shd w:val="clear" w:color="auto" w:fill="D6E4F7"/>
+          </w:tcPr>
+          <w:p>
+            <w:pPr>
+              <w:jc w:val="left"/>
+            </w:pPr>
+            <w:r>
+              <w:rPr>
+                <w:rFonts w:ascii="Calibri" w:hAnsi="Calibri"/>
+                <w:b/>
+                <w:i w:val="0"/>
+                <w:color w:val="000000"/>
+                <w:sz w:val="20"/>
+              </w:rPr>
+              <w:t>4</w:t>
+            </w:r>
+          </w:p>
+        </w:tc>
+        <w:tc>
+          <w:tcPr>
+            <w:tcW w:type="dxa" w:w="3120"/>
+          </w:tcPr>
+          <w:p>
+            <w:pPr>
+              <w:jc w:val="left"/>
+            </w:pPr>
+            <w:r>
+              <w:rPr>
+                <w:rFonts w:ascii="Calibri" w:hAnsi="Calibri"/>
+                <w:b w:val="0"/>
+                <w:i w:val="0"/>
+                <w:color w:val="000000"/>
+                <w:sz w:val="20"/>
+              </w:rPr>
+              <w:t>BRAM pixel source</w:t>
+            </w:r>
+          </w:p>
+        </w:tc>
+        <w:tc>
+          <w:tcPr>
+            <w:tcW w:type="dxa" w:w="3120"/>
+          </w:tcPr>
+          <w:p>
+            <w:pPr>
+              <w:jc w:val="left"/>
+            </w:pPr>
+            <w:r>
+              <w:rPr>
+                <w:rFonts w:ascii="Calibri" w:hAnsi="Calibri"/>
+                <w:b w:val="0"/>
+                <w:i w:val="0"/>
+                <w:color w:val="000000"/>
+                <w:sz w:val="20"/>
+              </w:rPr>
+              <w:t>1-bit BRAM frame buffer (0=black, 1=brightness)</w:t>
+            </w:r>
+          </w:p>
+        </w:tc>
+      </w:tr>
+      <w:tr>
+        <w:tc>
+          <w:tcPr>
+            <w:tcW w:type="dxa" w:w="3120"/>
+            <w:shd w:val="clear" w:color="auto" w:fill="D6E4F7"/>
+          </w:tcPr>
+          <w:p>
+            <w:pPr>
+              <w:jc w:val="left"/>
+            </w:pPr>
+            <w:r>
+              <w:rPr>
+                <w:rFonts w:ascii="Calibri" w:hAnsi="Calibri"/>
+                <w:b/>
+                <w:i w:val="0"/>
+                <w:color w:val="000000"/>
+                <w:sz w:val="20"/>
+              </w:rPr>
+              <w:t>5</w:t>
+            </w:r>
+          </w:p>
+        </w:tc>
+        <w:tc>
+          <w:tcPr>
+            <w:tcW w:type="dxa" w:w="3120"/>
+          </w:tcPr>
+          <w:p>
+            <w:pPr>
+              <w:jc w:val="left"/>
+            </w:pPr>
+            <w:r>
+              <w:rPr>
+                <w:rFonts w:ascii="Calibri" w:hAnsi="Calibri"/>
+                <w:b/>
+                <w:i w:val="0"/>
+                <w:color w:val="000000"/>
+                <w:sz w:val="20"/>
+              </w:rPr>
+              <w:t>H-gradient + black end</w:t>
+            </w:r>
+          </w:p>
+        </w:tc>
+        <w:tc>
+          <w:tcPr>
+            <w:tcW w:type="dxa" w:w="3120"/>
+          </w:tcPr>
+          <w:p>
+            <w:pPr>
+              <w:jc w:val="left"/>
+            </w:pPr>
+            <w:r>
+              <w:rPr>
+                <w:rFonts w:ascii="Calibri" w:hAnsi="Calibri"/>
+                <w:b w:val="0"/>
+                <w:i w:val="0"/>
+                <w:color w:val="000000"/>
+                <w:sz w:val="20"/>
+              </w:rPr>
+              <w:t>10 grey steps + 1 black zone = 11 zones total</w:t>
+            </w:r>
+          </w:p>
+        </w:tc>
+      </w:tr>
+      <w:tr>
+        <w:tc>
+          <w:tcPr>
+            <w:tcW w:type="dxa" w:w="3120"/>
+            <w:shd w:val="clear" w:color="auto" w:fill="D6E4F7"/>
+          </w:tcPr>
+          <w:p>
+            <w:pPr>
+              <w:jc w:val="left"/>
+            </w:pPr>
+            <w:r>
+              <w:rPr>
+                <w:rFonts w:ascii="Calibri" w:hAnsi="Calibri"/>
+                <w:b/>
+                <w:i w:val="0"/>
+                <w:color w:val="000000"/>
+                <w:sz w:val="20"/>
+              </w:rPr>
+              <w:t>6</w:t>
+            </w:r>
+          </w:p>
+        </w:tc>
+        <w:tc>
+          <w:tcPr>
+            <w:tcW w:type="dxa" w:w="3120"/>
+          </w:tcPr>
+          <w:p>
+            <w:pPr>
+              <w:jc w:val="left"/>
+            </w:pPr>
+            <w:r>
+              <w:rPr>
+                <w:rFonts w:ascii="Calibri" w:hAnsi="Calibri"/>
+                <w:b/>
+                <w:i w:val="0"/>
+                <w:color w:val="000000"/>
+                <w:sz w:val="20"/>
+              </w:rPr>
+              <w:t>V-gradient + black end</w:t>
+            </w:r>
+          </w:p>
+        </w:tc>
+        <w:tc>
+          <w:tcPr>
+            <w:tcW w:type="dxa" w:w="3120"/>
+          </w:tcPr>
+          <w:p>
+            <w:pPr>
+              <w:jc w:val="left"/>
+            </w:pPr>
+            <w:r>
+              <w:rPr>
+                <w:rFonts w:ascii="Calibri" w:hAnsi="Calibri"/>
+                <w:b w:val="0"/>
+                <w:i w:val="0"/>
+                <w:color w:val="000000"/>
+                <w:sz w:val="20"/>
+              </w:rPr>
+              <w:t>10 grey steps + 1 black zone = 11 zones total</w:t>
+            </w:r>
+          </w:p>
+        </w:tc>
+      </w:tr>
+    </w:tbl>
+    <w:p/>
+    <w:p>
+      <w:pPr>
+        <w:spacing w:before="120" w:after="80"/>
+      </w:pPr>
+      <w:r>
+        <w:rPr>
+          <w:rFonts w:ascii="Calibri" w:hAnsi="Calibri"/>
+          <w:b/>
+          <w:color w:val="005B96"/>
+          <w:sz w:val="26"/>
+        </w:rPr>
+        <w:t>9.2  Key Timing Constants</w:t>
+      </w:r>
+    </w:p>
+    <w:tbl>
+      <w:tblPr>
+        <w:tblStyle w:val="TableGrid"/>
+        <w:tblW w:type="auto" w:w="0"/>
+        <w:tblLook w:firstColumn="1" w:firstRow="1" w:lastColumn="0" w:lastRow="0" w:noHBand="0" w:noVBand="1" w:val="04A0"/>
+      </w:tblPr>
+      <w:tblGrid>
+        <w:gridCol w:w="9360"/>
+      </w:tblGrid>
+      <w:tr>
+        <w:tc>
+          <w:tcPr>
+            <w:tcW w:type="dxa" w:w="9360"/>
+            <w:shd w:val="clear" w:color="auto" w:fill="F2F2F2"/>
+          </w:tcPr>
+          <w:p>
+            <w:pPr>
+              <w:spacing w:before="40" w:after="40"/>
+            </w:pPr>
+            <w:r>
+              <w:rPr>
+                <w:rFonts w:ascii="Courier New" w:hAnsi="Courier New"/>
+                <w:color w:val="1A1A1A"/>
+                <w:sz w:val="17"/>
+              </w:rPr>
+              <w:t>constant V_ACT_S_F1 : integer := 25;   -- F1 active video start (v_cnt)</w:t>
+              <w:br/>
+              <w:t>constant V_ACT_E_F1 : integer := 311;  -- F1 active video end</w:t>
+              <w:br/>
+              <w:t>constant V_ACT_S_F2 : integer := 337;  -- F2 active video start (v_cnt)</w:t>
+              <w:br/>
+              <w:t>constant V_ACT_E_F2 : integer := 623;  -- F2 active video end</w:t>
+              <w:br/>
+              <w:t>constant V_ACTIVE_F : integer := 288;  -- lines per field (zone calculations)</w:t>
+            </w:r>
+          </w:p>
+        </w:tc>
+      </w:tr>
+    </w:tbl>
+    <w:p>
+      <w:pPr>
+        <w:spacing w:after="100"/>
+        <w:ind w:left="216"/>
+      </w:pPr>
+      <w:r>
+        <w:rPr>
+          <w:rFonts w:ascii="Calibri" w:hAnsi="Calibri"/>
+          <w:sz w:val="20"/>
+        </w:rPr>
+        <w:t>V_ACT_S_F1=25 and V_ACT_S_F2=337 shift active video one line later than pal_tv_bram_top. On a 1-625 oscilloscope reference, this makes scope line 24 the first F1 video line and scope line 337 the first F2 video line, matching the old tester reference. V_ACTIVE_F=288 is kept unchanged for zone-width calculations even though the active window is 287 lines after the shift.</w:t>
+      </w:r>
+    </w:p>
+    <w:p>
+      <w:pPr>
+        <w:spacing w:before="120" w:after="80"/>
+      </w:pPr>
+      <w:r>
+        <w:rPr>
+          <w:rFonts w:ascii="Calibri" w:hAnsi="Calibri"/>
+          <w:b/>
+          <w:color w:val="005B96"/>
+          <w:sz w:val="26"/>
+        </w:rPr>
+        <w:t>9.3  Output Ports</w:t>
+      </w:r>
+    </w:p>
+    <w:tbl>
+      <w:tblPr>
+        <w:tblStyle w:val="TableGrid"/>
+        <w:tblW w:type="auto" w:w="0"/>
+        <w:tblLook w:firstColumn="1" w:firstRow="1" w:lastColumn="0" w:lastRow="0" w:noHBand="0" w:noVBand="1" w:val="04A0"/>
+      </w:tblPr>
+      <w:tblGrid>
+        <w:gridCol w:w="9360"/>
+      </w:tblGrid>
+      <w:tr>
+        <w:tc>
+          <w:tcPr>
+            <w:tcW w:type="dxa" w:w="9360"/>
+            <w:shd w:val="clear" w:color="auto" w:fill="F2F2F2"/>
+          </w:tcPr>
+          <w:p>
+            <w:pPr>
+              <w:spacing w:before="40" w:after="40"/>
+            </w:pPr>
+            <w:r>
+              <w:rPr>
+                <w:rFonts w:ascii="Courier New" w:hAnsi="Courier New"/>
+                <w:color w:val="1A1A1A"/>
+                <w:sz w:val="17"/>
+              </w:rPr>
+              <w:t>dac_out      : out std_logic_vector(3 downto 0);  -- 4-bit R-2R DAC</w:t>
+              <w:br/>
+              <w:t>csync_o      : out std_logic;   -- composite sync (HIGH = sync tip)</w:t>
+              <w:br/>
+              <w:t>line_sync_o  : out std_logic;   -- H-sync, suppressed during vsync</w:t>
+              <w:br/>
+              <w:t>frame_sync_o : out std_logic;   -- 25 Hz, F1 vsync only (v_cnt &lt;= 7)</w:t>
+              <w:br/>
+              <w:t>fss_o        : out std_logic;   -- 50 Hz Field Sync Signal</w:t>
+              <w:br/>
+              <w:t>field_o      : out std_logic;   -- 0=Field1, 1=Field2</w:t>
+              <w:br/>
+              <w:t>active_o     : out std_logic;   -- active pixel window</w:t>
+              <w:br/>
+              <w:t>blank_o      : out std_logic;   -- HIGH during H-blank + V-blank</w:t>
+            </w:r>
+          </w:p>
+        </w:tc>
+      </w:tr>
+    </w:tbl>
+    <w:p>
+      <w:pPr>
+        <w:spacing w:after="100"/>
+        <w:ind w:left="216"/>
+      </w:pPr>
+      <w:r>
+        <w:rPr>
+          <w:rFonts w:ascii="Calibri" w:hAnsi="Calibri"/>
+          <w:sz w:val="20"/>
+        </w:rPr>
+        <w:t>frame_sync_o fires only during F1 vsync (v_cnt&lt;=7) giving a 25 Hz frame reference. fss_o is the Field Synchronising Signal at 50 Hz covering the broad-sync and post-equalising intervals of every field. blank_o = not active_s, staying HIGH for the full 12 µs H-blanking interval (front porch + sync + back porch) and all V-blanking lines.</w:t>
+      </w:r>
+    </w:p>
+    <w:p>
+      <w:pPr>
+        <w:spacing w:before="120" w:after="80"/>
+      </w:pPr>
+      <w:r>
+        <w:rPr>
+          <w:rFonts w:ascii="Calibri" w:hAnsi="Calibri"/>
+          <w:b/>
+          <w:color w:val="005B96"/>
+          <w:sz w:val="26"/>
+        </w:rPr>
+        <w:t>9.4  FSS Logic — Sub-Line Precision</w:t>
+      </w:r>
+    </w:p>
+    <w:tbl>
+      <w:tblPr>
+        <w:tblStyle w:val="TableGrid"/>
+        <w:tblW w:type="auto" w:w="0"/>
+        <w:tblLook w:firstColumn="1" w:firstRow="1" w:lastColumn="0" w:lastRow="0" w:noHBand="0" w:noVBand="1" w:val="04A0"/>
+      </w:tblPr>
+      <w:tblGrid>
+        <w:gridCol w:w="9360"/>
+      </w:tblGrid>
+      <w:tr>
+        <w:tc>
+          <w:tcPr>
+            <w:tcW w:type="dxa" w:w="9360"/>
+            <w:shd w:val="clear" w:color="auto" w:fill="F2F2F2"/>
+          </w:tcPr>
+          <w:p>
+            <w:pPr>
+              <w:spacing w:before="40" w:after="40"/>
+            </w:pPr>
+            <w:r>
+              <w:rPr>
+                <w:rFonts w:ascii="Courier New" w:hAnsi="Courier New"/>
+                <w:color w:val="1A1A1A"/>
+                <w:sz w:val="17"/>
+              </w:rPr>
+              <w:t>-- F1 FSS: v_cnt 3-7 (line-level, both halves)</w:t>
+              <w:br/>
+              <w:t>-- F2 FSS: starts at last half of v_cnt=315 (h&gt;=320),</w:t>
+              <w:br/>
+              <w:t>--         ends at first half of v_cnt=320 (h&lt;320)</w:t>
+              <w:br/>
+              <w:t>fss_s &lt;= '1' when (v_cnt &gt;= 3 and v_cnt &lt;= 7) or</w:t>
+              <w:br/>
+              <w:t xml:space="preserve">                  (v_cnt = 315 and h_cnt &gt;= 320) or</w:t>
+              <w:br/>
+              <w:t xml:space="preserve">                  (v_cnt &gt;= 316 and v_cnt &lt;= 319) or</w:t>
+              <w:br/>
+              <w:t xml:space="preserve">                  (v_cnt = 320 and h_cnt &lt; 320)</w:t>
+              <w:br/>
+              <w:t xml:space="preserve">         else '0';</w:t>
+            </w:r>
+          </w:p>
+        </w:tc>
+      </w:tr>
+    </w:tbl>
+    <w:p>
+      <w:pPr>
+        <w:spacing w:after="100"/>
+        <w:ind w:left="216"/>
+      </w:pPr>
+      <w:r>
+        <w:rPr>
+          <w:rFonts w:ascii="Calibri" w:hAnsi="Calibri"/>
+          <w:sz w:val="20"/>
+        </w:rPr>
+        <w:t>PAL interlaced Field 2 starts half a line offset from Field 1 (at v_cnt=312, h=320). This shifts the F2 broad-sync start half a line relative to where the F1 broad-sync starts. The old tester FSS for F2 therefore begins at scope line 314 last half (v_cnt=315, h=320) and ends at scope line 319 first half (v_cnt=320, h&lt;320), giving exactly 5 full lines = 320 µs. Using h_cnt in the FSS condition achieves this sub-line precision. F1 FSS uses whole-line boundaries (v_cnt 3-7) because F1 starts at h=0 and no half-line adjustment is needed. line_sync_o is independent of fss_o — both are computed separately.</w:t>
+      </w:r>
+    </w:p>
+    <w:p>
+      <w:pPr>
+        <w:spacing w:before="120" w:after="80"/>
+      </w:pPr>
+      <w:r>
+        <w:rPr>
+          <w:rFonts w:ascii="Calibri" w:hAnsi="Calibri"/>
+          <w:b/>
+          <w:color w:val="005B96"/>
+          <w:sz w:val="26"/>
+        </w:rPr>
+        <w:t>9.5  11-Zone Gradient (sel 5/6)</w:t>
+      </w:r>
+    </w:p>
+    <w:tbl>
+      <w:tblPr>
+        <w:tblStyle w:val="TableGrid"/>
+        <w:tblW w:type="auto" w:w="0"/>
+        <w:tblLook w:firstColumn="1" w:firstRow="1" w:lastColumn="0" w:lastRow="0" w:noHBand="0" w:noVBand="1" w:val="04A0"/>
+      </w:tblPr>
+      <w:tblGrid>
+        <w:gridCol w:w="9360"/>
+      </w:tblGrid>
+      <w:tr>
+        <w:tc>
+          <w:tcPr>
+            <w:tcW w:type="dxa" w:w="9360"/>
+            <w:shd w:val="clear" w:color="auto" w:fill="F2F2F2"/>
+          </w:tcPr>
+          <w:p>
+            <w:pPr>
+              <w:spacing w:before="40" w:after="40"/>
+            </w:pPr>
+            <w:r>
+              <w:rPr>
+                <w:rFonts w:ascii="Courier New" w:hAnsi="Courier New"/>
+                <w:color w:val="1A1A1A"/>
+                <w:sz w:val="17"/>
+              </w:rPr>
+              <w:t>constant GZONES_B  : integer := 11;</w:t>
+              <w:br/>
+              <w:t>constant GZONE_W_B : integer := H_ACTIVE / GZONES_B;  -- 47 px per zone</w:t>
+              <w:br/>
+              <w:t>constant GZONE_H_B : integer := V_ACTIVE_F / GZONES_B; -- 26 lines per zone</w:t>
+              <w:br/>
+              <w:br/>
+              <w:t>-- Zones 0-9: grey gradient  (black_level to white_level)</w:t>
+              <w:br/>
+              <w:t>-- Zone 10  : black_level    (gbzx_idx &gt;= GZONES = 10)</w:t>
+            </w:r>
+          </w:p>
+        </w:tc>
+      </w:tr>
+    </w:tbl>
+    <w:p>
+      <w:pPr>
+        <w:spacing w:after="100"/>
+        <w:ind w:left="216"/>
+      </w:pPr>
+      <w:r>
+        <w:rPr>
+          <w:rFonts w:ascii="Calibri" w:hAnsi="Calibri"/>
+          <w:sz w:val="20"/>
+        </w:rPr>
+        <w:t>sel=5 (H-gradient) and sel=6 (V-gradient) use dedicated counters gbzx_idx/gbpx_in (horizontal) and gbzy_idx/gbln_in (vertical). Zone indices 0-9 map to evenly spaced grey levels between black_level and white_level. Zone index 10 outputs black_level, creating a visible dark band at the right edge (sel=5) or bottom edge (sel=6). This differs from sel=2/3 which end at white and have no black-end zone.</w:t>
+      </w:r>
+    </w:p>
+    <w:p>
+      <w:pPr>
+        <w:spacing w:before="120" w:after="80"/>
+      </w:pPr>
+      <w:r>
+        <w:rPr>
+          <w:rFonts w:ascii="Calibri" w:hAnsi="Calibri"/>
+          <w:b/>
+          <w:color w:val="005B96"/>
+          <w:sz w:val="26"/>
+        </w:rPr>
+        <w:t>9.6  DAC Output Priority</w:t>
+      </w:r>
+    </w:p>
+    <w:tbl>
+      <w:tblPr>
+        <w:tblStyle w:val="TableGrid"/>
+        <w:tblW w:type="auto" w:w="0"/>
+        <w:tblLook w:firstColumn="1" w:firstRow="1" w:lastColumn="0" w:lastRow="0" w:noHBand="0" w:noVBand="1" w:val="04A0"/>
+      </w:tblPr>
+      <w:tblGrid>
+        <w:gridCol w:w="9360"/>
+      </w:tblGrid>
+      <w:tr>
+        <w:tc>
+          <w:tcPr>
+            <w:tcW w:type="dxa" w:w="9360"/>
+            <w:shd w:val="clear" w:color="auto" w:fill="F2F2F2"/>
+          </w:tcPr>
+          <w:p>
+            <w:pPr>
+              <w:spacing w:before="40" w:after="40"/>
+            </w:pPr>
+            <w:r>
+              <w:rPr>
+                <w:rFonts w:ascii="Courier New" w:hAnsi="Courier New"/>
+                <w:color w:val="1A1A1A"/>
+                <w:sz w:val="17"/>
+              </w:rPr>
+              <w:t>dac_out &lt;= LEVEL_SYNC   when csync_s  = '1' else</w:t>
+              <w:br/>
+              <w:t xml:space="preserve">           active_level when active_s = '1' else</w:t>
+              <w:br/>
+              <w:t xml:space="preserve">           LEVEL_BLANK;</w:t>
+            </w:r>
+          </w:p>
+        </w:tc>
+      </w:tr>
+    </w:tbl>
+    <w:p>
+      <w:pPr>
+        <w:spacing w:after="100"/>
+        <w:ind w:left="216"/>
+      </w:pPr>
+      <w:r>
+        <w:rPr>
+          <w:rFonts w:ascii="Calibri" w:hAnsi="Calibri"/>
+          <w:sz w:val="20"/>
+        </w:rPr>
+        <w:t>Three-level priority identical to pal_tv_bram_top: sync tip (0x0) overrides everything, then pattern video (0x4–0xF) during active pixels, then blanking level (0x4) otherwise. LEVEL_SYNC="0000", LEVEL_BLANK="0100" are entity generics defaulting to standard PAL 4-bit R-2R DAC levels.</w:t>
+      </w:r>
+    </w:p>
     <w:sectPr>
       <w:pgSz w:w="12240" w:h="15840"/>
       <w:pgMar w:top="1296" w:right="1440" w:bottom="1296" w:left="1440" w:header="720" w:footer="720" w:gutter="0"/>

</xml_diff>